<commit_message>
[dosc]: project milestone 3 upload
</commit_message>
<xml_diff>
--- a/project/doc/Final Project Milestone.docx
+++ b/project/doc/Final Project Milestone.docx
@@ -25,7 +25,7 @@
           <w:b/>
           <w:bCs/>
         </w:rPr>
-        <w:t>2</w:t>
+        <w:t>3</w:t>
       </w:r>
       <w:r>
         <w:rPr>
@@ -81,7 +81,7 @@
         <w:rPr>
           <w:rFonts w:ascii="Times New Roman" w:hAnsi="Times New Roman" w:cs="Times New Roman"/>
         </w:rPr>
-        <w:t>2</w:t>
+        <w:t>3</w:t>
       </w:r>
       <w:r>
         <w:rPr>
@@ -95,7 +95,7 @@
             <w:rStyle w:val="Hyperlink"/>
             <w:rFonts w:ascii="Times New Roman" w:hAnsi="Times New Roman" w:cs="Times New Roman"/>
           </w:rPr>
-          <w:t>https://youtu.be/zUZmtsXSH5M</w:t>
+          <w:t>https://youtu.be/6PP2SinbIBs</w:t>
         </w:r>
       </w:hyperlink>
     </w:p>
@@ -105,54 +105,6 @@
           <w:rFonts w:ascii="Times New Roman" w:hAnsi="Times New Roman" w:cs="Times New Roman"/>
         </w:rPr>
       </w:pPr>
-    </w:p>
-    <w:p>
-      <w:pPr>
-        <w:rPr>
-          <w:rFonts w:ascii="Times New Roman" w:hAnsi="Times New Roman" w:cs="Times New Roman"/>
-        </w:rPr>
-      </w:pPr>
-      <w:r>
-        <w:rPr>
-          <w:rFonts w:ascii="Times New Roman" w:hAnsi="Times New Roman" w:cs="Times New Roman"/>
-        </w:rPr>
-        <w:t xml:space="preserve">Animated Video of Business Milestone </w:t>
-      </w:r>
-      <w:r>
-        <w:rPr>
-          <w:rFonts w:ascii="Times New Roman" w:hAnsi="Times New Roman" w:cs="Times New Roman"/>
-        </w:rPr>
-        <w:t>2</w:t>
-      </w:r>
-      <w:r>
-        <w:rPr>
-          <w:rFonts w:ascii="Times New Roman" w:hAnsi="Times New Roman" w:cs="Times New Roman"/>
-        </w:rPr>
-        <w:t xml:space="preserve">: </w:t>
-      </w:r>
-      <w:hyperlink r:id="rId5" w:history="1">
-        <w:r>
-          <w:rPr>
-            <w:rStyle w:val="Hyperlink"/>
-            <w:rFonts w:ascii="Times New Roman" w:hAnsi="Times New Roman" w:cs="Times New Roman"/>
-          </w:rPr>
-          <w:t>https://</w:t>
-        </w:r>
-        <w:r>
-          <w:rPr>
-            <w:rStyle w:val="Hyperlink"/>
-            <w:rFonts w:ascii="Times New Roman" w:hAnsi="Times New Roman" w:cs="Times New Roman"/>
-          </w:rPr>
-          <w:t>y</w:t>
-        </w:r>
-        <w:r>
-          <w:rPr>
-            <w:rStyle w:val="Hyperlink"/>
-            <w:rFonts w:ascii="Times New Roman" w:hAnsi="Times New Roman" w:cs="Times New Roman"/>
-          </w:rPr>
-          <w:t>outu.be/-QpsmUE8kr0?si=Agf2d7ikPobqwDEO</w:t>
-        </w:r>
-      </w:hyperlink>
     </w:p>
     <w:sectPr>
       <w:pgSz w:w="12240" w:h="15840"/>

</xml_diff>